<commit_message>
Update Birkdale Village Brainstorming.docx
</commit_message>
<xml_diff>
--- a/Documents/Level II - Malice at McGuire/Birkdale Village Brainstorming.docx
+++ b/Documents/Level II - Malice at McGuire/Birkdale Village Brainstorming.docx
@@ -37,7 +37,35 @@
         <w:rPr>
           <w:rFonts w:ascii="Times New Roman" w:hAnsi="Times New Roman" w:cs="Times New Roman"/>
         </w:rPr>
-        <w:t xml:space="preserve">I know that Birkdale is supposed to be the more accepting side for the Altered, so seeing people walking around that have physical deformities won’t be all that weird. It’ll be impressive, slightly encouraging, and will emulate what life used to be before the Icarus Incident. The player character will feel remorse and if Alistair is there he’ll comment on the possible future that could be had if Gaia continues their work. This will surprise the player commenting on how he isn’t blaming them for this and will explain that when Gaia’s Advocates does complete it’s </w:t>
+        <w:t xml:space="preserve">I know that Birkdale is supposed to be the more accepting side for the Altered, so seeing people walking around that have physical deformities won’t be all that weird. It’ll be impressive, slightly encouraging, and will emulate what life used to be before the Icarus Incident. The player character will feel remorse and if Alistair is </w:t>
+      </w:r>
+      <w:proofErr w:type="gramStart"/>
+      <w:r>
+        <w:rPr>
+          <w:rFonts w:ascii="Times New Roman" w:hAnsi="Times New Roman" w:cs="Times New Roman"/>
+        </w:rPr>
+        <w:t>there</w:t>
+      </w:r>
+      <w:proofErr w:type="gramEnd"/>
+      <w:r>
+        <w:rPr>
+          <w:rFonts w:ascii="Times New Roman" w:hAnsi="Times New Roman" w:cs="Times New Roman"/>
+        </w:rPr>
+        <w:t xml:space="preserve"> he’ll comment on the possible future that could be had if Gaia continues their work. This will surprise the player commenting on how he isn’t blaming them for this and will explain that when Gaia’s Advocates does complete </w:t>
+      </w:r>
+      <w:proofErr w:type="gramStart"/>
+      <w:r>
+        <w:rPr>
+          <w:rFonts w:ascii="Times New Roman" w:hAnsi="Times New Roman" w:cs="Times New Roman"/>
+        </w:rPr>
+        <w:t>it’s</w:t>
+      </w:r>
+      <w:proofErr w:type="gramEnd"/>
+      <w:r>
+        <w:rPr>
+          <w:rFonts w:ascii="Times New Roman" w:hAnsi="Times New Roman" w:cs="Times New Roman"/>
+        </w:rPr>
+        <w:t xml:space="preserve"> </w:t>
       </w:r>
       <w:r>
         <w:rPr>
@@ -166,7 +194,21 @@
         <w:rPr>
           <w:rFonts w:ascii="Times New Roman" w:hAnsi="Times New Roman" w:cs="Times New Roman"/>
         </w:rPr>
-        <w:t xml:space="preserve"> You notice more and more of the people walking around are Altered in some sense, but it doesn’t seem to bother anyone. No one is hiding or ashamed of their differences. You see blend of Altered and humans in a platoon of soldiers jogging in their black and yellow winter exercise uniform chanting songs before meeting with a group of soldiers with rifles outside of a large building and military trucks. Even with the heavy military presence, there is an air of liveliness and serenity with the people. It’s as if life here had return to what it used to be with humans and Altered alike.</w:t>
+        <w:t xml:space="preserve"> You notice more and more of the people walking around are Altered in some sense, but it doesn’t seem to bother anyone. No one is hiding or ashamed of their differences. You see blend of Altered and humans in a platoon of soldiers jogging in their black and yellow winter exercise uniform chanting songs before meeting with a group of soldiers with rifles outside of a large building and military trucks. Even with the heavy military presence, there is an air of liveliness and serenity with the people. It’s as if life here had return to what it used to be with humans and </w:t>
+      </w:r>
+      <w:proofErr w:type="gramStart"/>
+      <w:r>
+        <w:rPr>
+          <w:rFonts w:ascii="Times New Roman" w:hAnsi="Times New Roman" w:cs="Times New Roman"/>
+        </w:rPr>
+        <w:t>Altered</w:t>
+      </w:r>
+      <w:proofErr w:type="gramEnd"/>
+      <w:r>
+        <w:rPr>
+          <w:rFonts w:ascii="Times New Roman" w:hAnsi="Times New Roman" w:cs="Times New Roman"/>
+        </w:rPr>
+        <w:t xml:space="preserve"> alike.</w:t>
       </w:r>
     </w:p>
     <w:p>
@@ -180,20 +222,48 @@
           <w:rFonts w:ascii="Times New Roman" w:hAnsi="Times New Roman" w:cs="Times New Roman"/>
         </w:rPr>
         <w:lastRenderedPageBreak/>
-        <w:t>Bruno: After the invasion of HU.N.T.R, their predatory hatred for the Altered forced a strong sense of community to protect the people of Birkdale.</w:t>
-      </w:r>
-    </w:p>
-    <w:p>
-      <w:pPr>
-        <w:rPr>
-          <w:rFonts w:ascii="Times New Roman" w:hAnsi="Times New Roman" w:cs="Times New Roman"/>
-        </w:rPr>
-      </w:pPr>
-      <w:r>
-        <w:rPr>
-          <w:rFonts w:ascii="Times New Roman" w:hAnsi="Times New Roman" w:cs="Times New Roman"/>
-        </w:rPr>
-        <w:t>Bruno: Thanks to the Mayor contacting the government, the people feel much more safe going outside.</w:t>
+        <w:t>Bruno: After the invasion of HU.N.</w:t>
+      </w:r>
+      <w:proofErr w:type="gramStart"/>
+      <w:r>
+        <w:rPr>
+          <w:rFonts w:ascii="Times New Roman" w:hAnsi="Times New Roman" w:cs="Times New Roman"/>
+        </w:rPr>
+        <w:t>T.R</w:t>
+      </w:r>
+      <w:proofErr w:type="gramEnd"/>
+      <w:r>
+        <w:rPr>
+          <w:rFonts w:ascii="Times New Roman" w:hAnsi="Times New Roman" w:cs="Times New Roman"/>
+        </w:rPr>
+        <w:t>, their predatory hatred for the Altered forced a strong sense of community to protect the people of Birkdale.</w:t>
+      </w:r>
+    </w:p>
+    <w:p>
+      <w:pPr>
+        <w:rPr>
+          <w:rFonts w:ascii="Times New Roman" w:hAnsi="Times New Roman" w:cs="Times New Roman"/>
+        </w:rPr>
+      </w:pPr>
+      <w:r>
+        <w:rPr>
+          <w:rFonts w:ascii="Times New Roman" w:hAnsi="Times New Roman" w:cs="Times New Roman"/>
+        </w:rPr>
+        <w:t xml:space="preserve">Bruno: Thanks to the Mayor contacting the government, the people feel much </w:t>
+      </w:r>
+      <w:proofErr w:type="gramStart"/>
+      <w:r>
+        <w:rPr>
+          <w:rFonts w:ascii="Times New Roman" w:hAnsi="Times New Roman" w:cs="Times New Roman"/>
+        </w:rPr>
+        <w:t>more safe</w:t>
+      </w:r>
+      <w:proofErr w:type="gramEnd"/>
+      <w:r>
+        <w:rPr>
+          <w:rFonts w:ascii="Times New Roman" w:hAnsi="Times New Roman" w:cs="Times New Roman"/>
+        </w:rPr>
+        <w:t xml:space="preserve"> going outside.</w:t>
       </w:r>
     </w:p>
     <w:p>
@@ -310,7 +380,21 @@
         <w:rPr>
           <w:rFonts w:ascii="Times New Roman" w:hAnsi="Times New Roman" w:cs="Times New Roman"/>
         </w:rPr>
-        <w:t xml:space="preserve">Bruno: I’d recommend talking to the people and eventually the Mayor for a more complete picture of things. </w:t>
+        <w:t xml:space="preserve">Bruno: I’d recommend talking to the people and eventually the </w:t>
+      </w:r>
+      <w:proofErr w:type="gramStart"/>
+      <w:r>
+        <w:rPr>
+          <w:rFonts w:ascii="Times New Roman" w:hAnsi="Times New Roman" w:cs="Times New Roman"/>
+        </w:rPr>
+        <w:t>Mayor</w:t>
+      </w:r>
+      <w:proofErr w:type="gramEnd"/>
+      <w:r>
+        <w:rPr>
+          <w:rFonts w:ascii="Times New Roman" w:hAnsi="Times New Roman" w:cs="Times New Roman"/>
+        </w:rPr>
+        <w:t xml:space="preserve"> for a more complete picture of things. </w:t>
       </w:r>
     </w:p>
     <w:p>
@@ -491,7 +575,21 @@
         <w:rPr>
           <w:rFonts w:ascii="Times New Roman" w:hAnsi="Times New Roman" w:cs="Times New Roman"/>
         </w:rPr>
-        <w:t xml:space="preserve">s, so I might jot down ideas for conversations, but for the most part I won’t focus on it. I need to figure out how the player actually gets to speak to the mayor. Should their be a requirement or </w:t>
+        <w:t xml:space="preserve">s, so I might jot down ideas for conversations, but for the most part I won’t focus on it. I need to figure out how the player actually gets to speak to the mayor. Should </w:t>
+      </w:r>
+      <w:proofErr w:type="gramStart"/>
+      <w:r>
+        <w:rPr>
+          <w:rFonts w:ascii="Times New Roman" w:hAnsi="Times New Roman" w:cs="Times New Roman"/>
+        </w:rPr>
+        <w:t>their</w:t>
+      </w:r>
+      <w:proofErr w:type="gramEnd"/>
+      <w:r>
+        <w:rPr>
+          <w:rFonts w:ascii="Times New Roman" w:hAnsi="Times New Roman" w:cs="Times New Roman"/>
+        </w:rPr>
+        <w:t xml:space="preserve"> be a requirement or </w:t>
       </w:r>
       <w:r>
         <w:rPr>
@@ -1483,7 +1581,21 @@
         <w:rPr>
           <w:rFonts w:ascii="Times New Roman" w:hAnsi="Times New Roman" w:cs="Times New Roman"/>
         </w:rPr>
-        <w:t>contact him, that contacting him is necessary to stop the upcoming expected battle, and even if she wanted to she hasn’t heard anything from him</w:t>
+        <w:t xml:space="preserve">contact him, that contacting him is necessary to stop the upcoming expected battle, and even if she wanted </w:t>
+      </w:r>
+      <w:proofErr w:type="gramStart"/>
+      <w:r>
+        <w:rPr>
+          <w:rFonts w:ascii="Times New Roman" w:hAnsi="Times New Roman" w:cs="Times New Roman"/>
+        </w:rPr>
+        <w:t>to</w:t>
+      </w:r>
+      <w:proofErr w:type="gramEnd"/>
+      <w:r>
+        <w:rPr>
+          <w:rFonts w:ascii="Times New Roman" w:hAnsi="Times New Roman" w:cs="Times New Roman"/>
+        </w:rPr>
+        <w:t xml:space="preserve"> she hasn’t heard anything from him</w:t>
       </w:r>
       <w:r>
         <w:rPr>
@@ -2366,7 +2478,21 @@
         <w:rPr>
           <w:rFonts w:ascii="Times New Roman" w:hAnsi="Times New Roman" w:cs="Times New Roman"/>
         </w:rPr>
-        <w:t>There’s a lot of work to still do for this side, but for the most part things are figured out. Once the main stuff is done I’ll consider</w:t>
+        <w:t xml:space="preserve">There’s a lot of work to still do for this side, but for the most part things are figured out. Once the main stuff is </w:t>
+      </w:r>
+      <w:proofErr w:type="gramStart"/>
+      <w:r>
+        <w:rPr>
+          <w:rFonts w:ascii="Times New Roman" w:hAnsi="Times New Roman" w:cs="Times New Roman"/>
+        </w:rPr>
+        <w:t>done</w:t>
+      </w:r>
+      <w:proofErr w:type="gramEnd"/>
+      <w:r>
+        <w:rPr>
+          <w:rFonts w:ascii="Times New Roman" w:hAnsi="Times New Roman" w:cs="Times New Roman"/>
+        </w:rPr>
+        <w:t xml:space="preserve"> I’ll consider</w:t>
       </w:r>
       <w:r>
         <w:rPr>
@@ -2578,6 +2704,110 @@
           <w:rFonts w:ascii="Times New Roman" w:hAnsi="Times New Roman" w:cs="Times New Roman"/>
         </w:rPr>
         <w:t>d’ve said yes. That she still would say yes</w:t>
+      </w:r>
+      <w:r>
+        <w:rPr>
+          <w:rFonts w:ascii="Times New Roman" w:hAnsi="Times New Roman" w:cs="Times New Roman"/>
+        </w:rPr>
+        <w:t>.</w:t>
+      </w:r>
+    </w:p>
+    <w:p>
+      <w:pPr>
+        <w:rPr>
+          <w:rFonts w:ascii="Times New Roman" w:hAnsi="Times New Roman" w:cs="Times New Roman"/>
+        </w:rPr>
+      </w:pPr>
+      <w:r>
+        <w:rPr>
+          <w:rFonts w:ascii="Times New Roman" w:hAnsi="Times New Roman" w:cs="Times New Roman"/>
+        </w:rPr>
+        <w:t>---------------------------------------------------------------------------------------------------------------------</w:t>
+      </w:r>
+    </w:p>
+    <w:p>
+      <w:pPr>
+        <w:rPr>
+          <w:rFonts w:ascii="Times New Roman" w:hAnsi="Times New Roman" w:cs="Times New Roman"/>
+        </w:rPr>
+      </w:pPr>
+      <w:r>
+        <w:rPr>
+          <w:rFonts w:ascii="Times New Roman" w:hAnsi="Times New Roman" w:cs="Times New Roman"/>
+        </w:rPr>
+        <w:t xml:space="preserve">I think the Electronics Part Shop would be the easiest to work on. </w:t>
+      </w:r>
+      <w:r>
+        <w:rPr>
+          <w:rFonts w:ascii="Times New Roman" w:hAnsi="Times New Roman" w:cs="Times New Roman"/>
+        </w:rPr>
+        <w:t>The only person of interest would be Julian here and it can connect to the gooner Pokémon battle since the younger brother is supposed to be in there.</w:t>
+      </w:r>
+      <w:r>
+        <w:rPr>
+          <w:rFonts w:ascii="Times New Roman" w:hAnsi="Times New Roman" w:cs="Times New Roman"/>
+        </w:rPr>
+        <w:t xml:space="preserve"> I’ll need to map out a few things and come up with items that Julian will need to his contraption. Speaking of, his </w:t>
+      </w:r>
+      <w:r>
+        <w:rPr>
+          <w:rFonts w:ascii="Times New Roman" w:hAnsi="Times New Roman" w:cs="Times New Roman"/>
+        </w:rPr>
+        <w:t xml:space="preserve">contraption can be a </w:t>
+      </w:r>
+      <w:r>
+        <w:rPr>
+          <w:rFonts w:ascii="Times New Roman" w:hAnsi="Times New Roman" w:cs="Times New Roman"/>
+        </w:rPr>
+        <w:t xml:space="preserve">badge tester/encryptor. He can </w:t>
+      </w:r>
+      <w:r>
+        <w:rPr>
+          <w:rFonts w:ascii="Times New Roman" w:hAnsi="Times New Roman" w:cs="Times New Roman"/>
+        </w:rPr>
+        <w:t>either scan a door and test multiple codes without triggering an alarm to gain access, but it’ll take a while or he can clone the encryption of a badge onto another badge to be used.</w:t>
+      </w:r>
+      <w:r>
+        <w:rPr>
+          <w:rFonts w:ascii="Times New Roman" w:hAnsi="Times New Roman" w:cs="Times New Roman"/>
+        </w:rPr>
+        <w:t xml:space="preserve"> What could be needed could be a </w:t>
+      </w:r>
+      <w:r>
+        <w:rPr>
+          <w:rFonts w:ascii="Times New Roman" w:hAnsi="Times New Roman" w:cs="Times New Roman"/>
+        </w:rPr>
+        <w:t>5-inch</w:t>
+      </w:r>
+      <w:r>
+        <w:rPr>
+          <w:rFonts w:ascii="Times New Roman" w:hAnsi="Times New Roman" w:cs="Times New Roman"/>
+        </w:rPr>
+        <w:t xml:space="preserve"> LCD screen, a raspberry pi chip, a power supply, </w:t>
+      </w:r>
+      <w:r>
+        <w:rPr>
+          <w:rFonts w:ascii="Times New Roman" w:hAnsi="Times New Roman" w:cs="Times New Roman"/>
+        </w:rPr>
+        <w:t xml:space="preserve">and an enclosure with buttons. Four things </w:t>
+      </w:r>
+      <w:r>
+        <w:rPr>
+          <w:rFonts w:ascii="Times New Roman" w:hAnsi="Times New Roman" w:cs="Times New Roman"/>
+        </w:rPr>
+        <w:t>aren’t</w:t>
+      </w:r>
+      <w:r>
+        <w:rPr>
+          <w:rFonts w:ascii="Times New Roman" w:hAnsi="Times New Roman" w:cs="Times New Roman"/>
+        </w:rPr>
+        <w:t xml:space="preserve"> too bad and the player has a means to raise funds as well. I can say the younger brother needs a graphics card</w:t>
+      </w:r>
+      <w:r>
+        <w:rPr>
+          <w:rFonts w:ascii="Times New Roman" w:hAnsi="Times New Roman" w:cs="Times New Roman"/>
+        </w:rPr>
+        <w:t xml:space="preserve"> from the shop that the player can purchase for them as part of the quest.</w:t>
       </w:r>
     </w:p>
     <w:p>

</xml_diff>

<commit_message>
Updated and New Sheets
</commit_message>
<xml_diff>
--- a/Documents/Level II - Malice at McGuire/Birkdale Village Brainstorming.docx
+++ b/Documents/Level II - Malice at McGuire/Birkdale Village Brainstorming.docx
@@ -37,35 +37,7 @@
         <w:rPr>
           <w:rFonts w:ascii="Times New Roman" w:hAnsi="Times New Roman" w:cs="Times New Roman"/>
         </w:rPr>
-        <w:t xml:space="preserve">I know that Birkdale is supposed to be the more accepting side for the Altered, so seeing people walking around that have physical deformities won’t be all that weird. It’ll be impressive, slightly encouraging, and will emulate what life used to be before the Icarus Incident. The player character will feel remorse and if Alistair is </w:t>
-      </w:r>
-      <w:proofErr w:type="gramStart"/>
-      <w:r>
-        <w:rPr>
-          <w:rFonts w:ascii="Times New Roman" w:hAnsi="Times New Roman" w:cs="Times New Roman"/>
-        </w:rPr>
-        <w:t>there</w:t>
-      </w:r>
-      <w:proofErr w:type="gramEnd"/>
-      <w:r>
-        <w:rPr>
-          <w:rFonts w:ascii="Times New Roman" w:hAnsi="Times New Roman" w:cs="Times New Roman"/>
-        </w:rPr>
-        <w:t xml:space="preserve"> he’ll comment on the possible future that could be had if Gaia continues their work. This will surprise the player commenting on how he isn’t blaming them for this and will explain that when Gaia’s Advocates does complete </w:t>
-      </w:r>
-      <w:proofErr w:type="gramStart"/>
-      <w:r>
-        <w:rPr>
-          <w:rFonts w:ascii="Times New Roman" w:hAnsi="Times New Roman" w:cs="Times New Roman"/>
-        </w:rPr>
-        <w:t>it’s</w:t>
-      </w:r>
-      <w:proofErr w:type="gramEnd"/>
-      <w:r>
-        <w:rPr>
-          <w:rFonts w:ascii="Times New Roman" w:hAnsi="Times New Roman" w:cs="Times New Roman"/>
-        </w:rPr>
-        <w:t xml:space="preserve"> </w:t>
+        <w:t xml:space="preserve">I know that Birkdale is supposed to be the more accepting side for the Altered, so seeing people walking around that have physical deformities won’t be all that weird. It’ll be impressive, slightly encouraging, and will emulate what life used to be before the Icarus Incident. The player character will feel remorse and if Alistair is there he’ll comment on the possible future that could be had if Gaia continues their work. This will surprise the player commenting on how he isn’t blaming them for this and will explain that when Gaia’s Advocates does complete it’s </w:t>
       </w:r>
       <w:r>
         <w:rPr>
@@ -194,21 +166,7 @@
         <w:rPr>
           <w:rFonts w:ascii="Times New Roman" w:hAnsi="Times New Roman" w:cs="Times New Roman"/>
         </w:rPr>
-        <w:t xml:space="preserve"> You notice more and more of the people walking around are Altered in some sense, but it doesn’t seem to bother anyone. No one is hiding or ashamed of their differences. You see blend of Altered and humans in a platoon of soldiers jogging in their black and yellow winter exercise uniform chanting songs before meeting with a group of soldiers with rifles outside of a large building and military trucks. Even with the heavy military presence, there is an air of liveliness and serenity with the people. It’s as if life here had return to what it used to be with humans and </w:t>
-      </w:r>
-      <w:proofErr w:type="gramStart"/>
-      <w:r>
-        <w:rPr>
-          <w:rFonts w:ascii="Times New Roman" w:hAnsi="Times New Roman" w:cs="Times New Roman"/>
-        </w:rPr>
-        <w:t>Altered</w:t>
-      </w:r>
-      <w:proofErr w:type="gramEnd"/>
-      <w:r>
-        <w:rPr>
-          <w:rFonts w:ascii="Times New Roman" w:hAnsi="Times New Roman" w:cs="Times New Roman"/>
-        </w:rPr>
-        <w:t xml:space="preserve"> alike.</w:t>
+        <w:t xml:space="preserve"> You notice more and more of the people walking around are Altered in some sense, but it doesn’t seem to bother anyone. No one is hiding or ashamed of their differences. You see blend of Altered and humans in a platoon of soldiers jogging in their black and yellow winter exercise uniform chanting songs before meeting with a group of soldiers with rifles outside of a large building and military trucks. Even with the heavy military presence, there is an air of liveliness and serenity with the people. It’s as if life here had return to what it used to be with humans and Altered alike.</w:t>
       </w:r>
     </w:p>
     <w:p>
@@ -222,48 +180,20 @@
           <w:rFonts w:ascii="Times New Roman" w:hAnsi="Times New Roman" w:cs="Times New Roman"/>
         </w:rPr>
         <w:lastRenderedPageBreak/>
-        <w:t>Bruno: After the invasion of HU.N.</w:t>
-      </w:r>
-      <w:proofErr w:type="gramStart"/>
-      <w:r>
-        <w:rPr>
-          <w:rFonts w:ascii="Times New Roman" w:hAnsi="Times New Roman" w:cs="Times New Roman"/>
-        </w:rPr>
-        <w:t>T.R</w:t>
-      </w:r>
-      <w:proofErr w:type="gramEnd"/>
-      <w:r>
-        <w:rPr>
-          <w:rFonts w:ascii="Times New Roman" w:hAnsi="Times New Roman" w:cs="Times New Roman"/>
-        </w:rPr>
-        <w:t>, their predatory hatred for the Altered forced a strong sense of community to protect the people of Birkdale.</w:t>
-      </w:r>
-    </w:p>
-    <w:p>
-      <w:pPr>
-        <w:rPr>
-          <w:rFonts w:ascii="Times New Roman" w:hAnsi="Times New Roman" w:cs="Times New Roman"/>
-        </w:rPr>
-      </w:pPr>
-      <w:r>
-        <w:rPr>
-          <w:rFonts w:ascii="Times New Roman" w:hAnsi="Times New Roman" w:cs="Times New Roman"/>
-        </w:rPr>
-        <w:t xml:space="preserve">Bruno: Thanks to the Mayor contacting the government, the people feel much </w:t>
-      </w:r>
-      <w:proofErr w:type="gramStart"/>
-      <w:r>
-        <w:rPr>
-          <w:rFonts w:ascii="Times New Roman" w:hAnsi="Times New Roman" w:cs="Times New Roman"/>
-        </w:rPr>
-        <w:t>more safe</w:t>
-      </w:r>
-      <w:proofErr w:type="gramEnd"/>
-      <w:r>
-        <w:rPr>
-          <w:rFonts w:ascii="Times New Roman" w:hAnsi="Times New Roman" w:cs="Times New Roman"/>
-        </w:rPr>
-        <w:t xml:space="preserve"> going outside.</w:t>
+        <w:t>Bruno: After the invasion of HU.N.T.R, their predatory hatred for the Altered forced a strong sense of community to protect the people of Birkdale.</w:t>
+      </w:r>
+    </w:p>
+    <w:p>
+      <w:pPr>
+        <w:rPr>
+          <w:rFonts w:ascii="Times New Roman" w:hAnsi="Times New Roman" w:cs="Times New Roman"/>
+        </w:rPr>
+      </w:pPr>
+      <w:r>
+        <w:rPr>
+          <w:rFonts w:ascii="Times New Roman" w:hAnsi="Times New Roman" w:cs="Times New Roman"/>
+        </w:rPr>
+        <w:t>Bruno: Thanks to the Mayor contacting the government, the people feel much more safe going outside.</w:t>
       </w:r>
     </w:p>
     <w:p>
@@ -380,21 +310,7 @@
         <w:rPr>
           <w:rFonts w:ascii="Times New Roman" w:hAnsi="Times New Roman" w:cs="Times New Roman"/>
         </w:rPr>
-        <w:t xml:space="preserve">Bruno: I’d recommend talking to the people and eventually the </w:t>
-      </w:r>
-      <w:proofErr w:type="gramStart"/>
-      <w:r>
-        <w:rPr>
-          <w:rFonts w:ascii="Times New Roman" w:hAnsi="Times New Roman" w:cs="Times New Roman"/>
-        </w:rPr>
-        <w:t>Mayor</w:t>
-      </w:r>
-      <w:proofErr w:type="gramEnd"/>
-      <w:r>
-        <w:rPr>
-          <w:rFonts w:ascii="Times New Roman" w:hAnsi="Times New Roman" w:cs="Times New Roman"/>
-        </w:rPr>
-        <w:t xml:space="preserve"> for a more complete picture of things. </w:t>
+        <w:t xml:space="preserve">Bruno: I’d recommend talking to the people and eventually the Mayor for a more complete picture of things. </w:t>
       </w:r>
     </w:p>
     <w:p>
@@ -575,21 +491,7 @@
         <w:rPr>
           <w:rFonts w:ascii="Times New Roman" w:hAnsi="Times New Roman" w:cs="Times New Roman"/>
         </w:rPr>
-        <w:t xml:space="preserve">s, so I might jot down ideas for conversations, but for the most part I won’t focus on it. I need to figure out how the player actually gets to speak to the mayor. Should </w:t>
-      </w:r>
-      <w:proofErr w:type="gramStart"/>
-      <w:r>
-        <w:rPr>
-          <w:rFonts w:ascii="Times New Roman" w:hAnsi="Times New Roman" w:cs="Times New Roman"/>
-        </w:rPr>
-        <w:t>their</w:t>
-      </w:r>
-      <w:proofErr w:type="gramEnd"/>
-      <w:r>
-        <w:rPr>
-          <w:rFonts w:ascii="Times New Roman" w:hAnsi="Times New Roman" w:cs="Times New Roman"/>
-        </w:rPr>
-        <w:t xml:space="preserve"> be a requirement or </w:t>
+        <w:t xml:space="preserve">s, so I might jot down ideas for conversations, but for the most part I won’t focus on it. I need to figure out how the player actually gets to speak to the mayor. Should their be a requirement or </w:t>
       </w:r>
       <w:r>
         <w:rPr>
@@ -1581,21 +1483,7 @@
         <w:rPr>
           <w:rFonts w:ascii="Times New Roman" w:hAnsi="Times New Roman" w:cs="Times New Roman"/>
         </w:rPr>
-        <w:t xml:space="preserve">contact him, that contacting him is necessary to stop the upcoming expected battle, and even if she wanted </w:t>
-      </w:r>
-      <w:proofErr w:type="gramStart"/>
-      <w:r>
-        <w:rPr>
-          <w:rFonts w:ascii="Times New Roman" w:hAnsi="Times New Roman" w:cs="Times New Roman"/>
-        </w:rPr>
-        <w:t>to</w:t>
-      </w:r>
-      <w:proofErr w:type="gramEnd"/>
-      <w:r>
-        <w:rPr>
-          <w:rFonts w:ascii="Times New Roman" w:hAnsi="Times New Roman" w:cs="Times New Roman"/>
-        </w:rPr>
-        <w:t xml:space="preserve"> she hasn’t heard anything from him</w:t>
+        <w:t>contact him, that contacting him is necessary to stop the upcoming expected battle, and even if she wanted to she hasn’t heard anything from him</w:t>
       </w:r>
       <w:r>
         <w:rPr>
@@ -2478,21 +2366,7 @@
         <w:rPr>
           <w:rFonts w:ascii="Times New Roman" w:hAnsi="Times New Roman" w:cs="Times New Roman"/>
         </w:rPr>
-        <w:t xml:space="preserve">There’s a lot of work to still do for this side, but for the most part things are figured out. Once the main stuff is </w:t>
-      </w:r>
-      <w:proofErr w:type="gramStart"/>
-      <w:r>
-        <w:rPr>
-          <w:rFonts w:ascii="Times New Roman" w:hAnsi="Times New Roman" w:cs="Times New Roman"/>
-        </w:rPr>
-        <w:t>done</w:t>
-      </w:r>
-      <w:proofErr w:type="gramEnd"/>
-      <w:r>
-        <w:rPr>
-          <w:rFonts w:ascii="Times New Roman" w:hAnsi="Times New Roman" w:cs="Times New Roman"/>
-        </w:rPr>
-        <w:t xml:space="preserve"> I’ll consider</w:t>
+        <w:t>There’s a lot of work to still do for this side, but for the most part things are figured out. Once the main stuff is done I’ll consider</w:t>
       </w:r>
       <w:r>
         <w:rPr>
@@ -2816,6 +2690,1117 @@
           <w:rFonts w:ascii="Times New Roman" w:hAnsi="Times New Roman" w:cs="Times New Roman"/>
         </w:rPr>
       </w:pPr>
+      <w:r>
+        <w:rPr>
+          <w:rFonts w:ascii="Times New Roman" w:hAnsi="Times New Roman" w:cs="Times New Roman"/>
+        </w:rPr>
+        <w:t>---------------------------------------------------------------------------------------------------------------------</w:t>
+      </w:r>
+    </w:p>
+    <w:p>
+      <w:pPr>
+        <w:rPr>
+          <w:rFonts w:ascii="Times New Roman" w:hAnsi="Times New Roman" w:cs="Times New Roman"/>
+        </w:rPr>
+      </w:pPr>
+      <w:r>
+        <w:rPr>
+          <w:rFonts w:ascii="Times New Roman" w:hAnsi="Times New Roman" w:cs="Times New Roman"/>
+        </w:rPr>
+        <w:t>It’s been a while since I’ve worked on this.</w:t>
+      </w:r>
+      <w:r>
+        <w:rPr>
+          <w:rFonts w:ascii="Times New Roman" w:hAnsi="Times New Roman" w:cs="Times New Roman"/>
+        </w:rPr>
+        <w:t xml:space="preserve"> I know the board says to work on the refugee center, I do think working on the shop would be easier as well as starting the side quest for the </w:t>
+      </w:r>
+      <w:r>
+        <w:rPr>
+          <w:rFonts w:ascii="Times New Roman" w:hAnsi="Times New Roman" w:cs="Times New Roman"/>
+        </w:rPr>
+        <w:t>brother related to the main streamer for the gooner battle. This should be pretty easy honestly.</w:t>
+      </w:r>
+    </w:p>
+    <w:p>
+      <w:pPr>
+        <w:rPr>
+          <w:rFonts w:ascii="Times New Roman" w:hAnsi="Times New Roman" w:cs="Times New Roman"/>
+        </w:rPr>
+      </w:pPr>
+      <w:r>
+        <w:rPr>
+          <w:rFonts w:ascii="Times New Roman" w:hAnsi="Times New Roman" w:cs="Times New Roman"/>
+        </w:rPr>
+        <w:t>---------------------------------------------------------------------------------------------------------------------</w:t>
+      </w:r>
+    </w:p>
+    <w:p>
+      <w:pPr>
+        <w:rPr>
+          <w:rFonts w:ascii="Times New Roman" w:hAnsi="Times New Roman" w:cs="Times New Roman"/>
+        </w:rPr>
+      </w:pPr>
+      <w:r>
+        <w:rPr>
+          <w:rFonts w:ascii="Times New Roman" w:hAnsi="Times New Roman" w:cs="Times New Roman"/>
+        </w:rPr>
+        <w:t>Back at it</w:t>
+      </w:r>
+      <w:r>
+        <w:rPr>
+          <w:rFonts w:ascii="Times New Roman" w:hAnsi="Times New Roman" w:cs="Times New Roman"/>
+        </w:rPr>
+        <w:t xml:space="preserve">. Let me use the last few to </w:t>
+      </w:r>
+      <w:r>
+        <w:rPr>
+          <w:rFonts w:ascii="Times New Roman" w:hAnsi="Times New Roman" w:cs="Times New Roman"/>
+        </w:rPr>
+        <w:t>set up the shop.</w:t>
+      </w:r>
+      <w:r>
+        <w:rPr>
+          <w:rFonts w:ascii="Times New Roman" w:hAnsi="Times New Roman" w:cs="Times New Roman"/>
+        </w:rPr>
+        <w:t xml:space="preserve"> </w:t>
+      </w:r>
+      <w:r>
+        <w:rPr>
+          <w:rFonts w:ascii="Times New Roman" w:hAnsi="Times New Roman" w:cs="Times New Roman"/>
+        </w:rPr>
+        <w:t>Alright</w:t>
+      </w:r>
+      <w:r>
+        <w:rPr>
+          <w:rFonts w:ascii="Times New Roman" w:hAnsi="Times New Roman" w:cs="Times New Roman"/>
+        </w:rPr>
+        <w:t>, what’s sold at the electronics shop?</w:t>
+      </w:r>
+    </w:p>
+    <w:p>
+      <w:pPr>
+        <w:rPr>
+          <w:rFonts w:ascii="Times New Roman" w:hAnsi="Times New Roman" w:cs="Times New Roman"/>
+        </w:rPr>
+      </w:pPr>
+      <w:r>
+        <w:rPr>
+          <w:rFonts w:ascii="Times New Roman" w:hAnsi="Times New Roman" w:cs="Times New Roman"/>
+        </w:rPr>
+        <w:t xml:space="preserve">How much money does the player start with? </w:t>
+      </w:r>
+      <w:r>
+        <w:rPr>
+          <w:rFonts w:ascii="Times New Roman" w:hAnsi="Times New Roman" w:cs="Times New Roman"/>
+        </w:rPr>
+        <w:t>Should be it good to always start with $100</w:t>
+      </w:r>
+      <w:r>
+        <w:rPr>
+          <w:rFonts w:ascii="Times New Roman" w:hAnsi="Times New Roman" w:cs="Times New Roman"/>
+        </w:rPr>
+        <w:t>? Prices can be higher too. It’ll incentivize the player to</w:t>
+      </w:r>
+      <w:r>
+        <w:rPr>
+          <w:rFonts w:ascii="Times New Roman" w:hAnsi="Times New Roman" w:cs="Times New Roman"/>
+        </w:rPr>
+        <w:t xml:space="preserve"> do the arm-wrestling game to raise funds. Maybe I can</w:t>
+      </w:r>
+      <w:r>
+        <w:rPr>
+          <w:rFonts w:ascii="Times New Roman" w:hAnsi="Times New Roman" w:cs="Times New Roman"/>
+        </w:rPr>
+        <w:t xml:space="preserve"> make it $200 since</w:t>
+      </w:r>
+      <w:r>
+        <w:rPr>
+          <w:rFonts w:ascii="Times New Roman" w:hAnsi="Times New Roman" w:cs="Times New Roman"/>
+        </w:rPr>
+        <w:t xml:space="preserve"> they did win the initial </w:t>
+      </w:r>
+      <w:r>
+        <w:rPr>
+          <w:rFonts w:ascii="Times New Roman" w:hAnsi="Times New Roman" w:cs="Times New Roman"/>
+        </w:rPr>
+        <w:t>arm-wrestling</w:t>
+      </w:r>
+      <w:r>
+        <w:rPr>
+          <w:rFonts w:ascii="Times New Roman" w:hAnsi="Times New Roman" w:cs="Times New Roman"/>
+        </w:rPr>
+        <w:t xml:space="preserve"> matches. Call it </w:t>
+      </w:r>
+      <w:r>
+        <w:rPr>
+          <w:rFonts w:ascii="Times New Roman" w:hAnsi="Times New Roman" w:cs="Times New Roman"/>
+        </w:rPr>
+        <w:t>their</w:t>
+      </w:r>
+      <w:r>
+        <w:rPr>
+          <w:rFonts w:ascii="Times New Roman" w:hAnsi="Times New Roman" w:cs="Times New Roman"/>
+        </w:rPr>
+        <w:t xml:space="preserve"> earnings from the </w:t>
+      </w:r>
+      <w:r>
+        <w:rPr>
+          <w:rFonts w:ascii="Times New Roman" w:hAnsi="Times New Roman" w:cs="Times New Roman"/>
+        </w:rPr>
+        <w:t>bets made by the patrons. So, an additional $100.</w:t>
+      </w:r>
+    </w:p>
+    <w:p>
+      <w:pPr>
+        <w:rPr>
+          <w:rFonts w:ascii="Times New Roman" w:hAnsi="Times New Roman" w:cs="Times New Roman"/>
+        </w:rPr>
+      </w:pPr>
+      <w:r>
+        <w:rPr>
+          <w:rFonts w:ascii="Times New Roman" w:hAnsi="Times New Roman" w:cs="Times New Roman"/>
+        </w:rPr>
+        <w:t>Alright, so that’s set</w:t>
+      </w:r>
+      <w:r>
+        <w:rPr>
+          <w:rFonts w:ascii="Times New Roman" w:hAnsi="Times New Roman" w:cs="Times New Roman"/>
+        </w:rPr>
+        <w:t>. I just need computer parts to put on sale with descriptions</w:t>
+      </w:r>
+      <w:r>
+        <w:rPr>
+          <w:rFonts w:ascii="Times New Roman" w:hAnsi="Times New Roman" w:cs="Times New Roman"/>
+        </w:rPr>
+        <w:t>. Prices should be relatively high</w:t>
+      </w:r>
+      <w:r>
+        <w:rPr>
+          <w:rFonts w:ascii="Times New Roman" w:hAnsi="Times New Roman" w:cs="Times New Roman"/>
+        </w:rPr>
+        <w:t xml:space="preserve">. Ranging from </w:t>
+      </w:r>
+      <w:r>
+        <w:rPr>
+          <w:rFonts w:ascii="Times New Roman" w:hAnsi="Times New Roman" w:cs="Times New Roman"/>
+        </w:rPr>
+        <w:t>$50 to $300. Overall, way too expensive for the player to afford initially.</w:t>
+      </w:r>
+      <w:r>
+        <w:rPr>
+          <w:rFonts w:ascii="Times New Roman" w:hAnsi="Times New Roman" w:cs="Times New Roman"/>
+        </w:rPr>
+        <w:t xml:space="preserve"> Forcing them to either sell items or</w:t>
+      </w:r>
+      <w:r>
+        <w:rPr>
+          <w:rFonts w:ascii="Times New Roman" w:hAnsi="Times New Roman" w:cs="Times New Roman"/>
+        </w:rPr>
+        <w:t xml:space="preserve"> do the mini game</w:t>
+      </w:r>
+      <w:r>
+        <w:rPr>
+          <w:rFonts w:ascii="Times New Roman" w:hAnsi="Times New Roman" w:cs="Times New Roman"/>
+        </w:rPr>
+        <w:t xml:space="preserve">. So </w:t>
+      </w:r>
+      <w:r>
+        <w:rPr>
+          <w:rFonts w:ascii="Times New Roman" w:hAnsi="Times New Roman" w:cs="Times New Roman"/>
+        </w:rPr>
+        <w:t>what’s being sold?</w:t>
+      </w:r>
+    </w:p>
+    <w:p>
+      <w:pPr>
+        <w:rPr>
+          <w:rFonts w:ascii="Times New Roman" w:hAnsi="Times New Roman" w:cs="Times New Roman"/>
+        </w:rPr>
+      </w:pPr>
+      <w:r>
+        <w:rPr>
+          <w:rFonts w:ascii="Times New Roman" w:hAnsi="Times New Roman" w:cs="Times New Roman"/>
+        </w:rPr>
+        <w:t>CPU</w:t>
+      </w:r>
+      <w:r>
+        <w:rPr>
+          <w:rFonts w:ascii="Times New Roman" w:hAnsi="Times New Roman" w:cs="Times New Roman"/>
+        </w:rPr>
+        <w:t xml:space="preserve">: </w:t>
+      </w:r>
+      <w:r>
+        <w:rPr>
+          <w:rFonts w:ascii="Times New Roman" w:hAnsi="Times New Roman" w:cs="Times New Roman"/>
+        </w:rPr>
+        <w:t>$</w:t>
+      </w:r>
+      <w:r>
+        <w:rPr>
+          <w:rFonts w:ascii="Times New Roman" w:hAnsi="Times New Roman" w:cs="Times New Roman"/>
+        </w:rPr>
+        <w:t>4</w:t>
+      </w:r>
+      <w:r>
+        <w:rPr>
+          <w:rFonts w:ascii="Times New Roman" w:hAnsi="Times New Roman" w:cs="Times New Roman"/>
+        </w:rPr>
+        <w:t>0</w:t>
+      </w:r>
+    </w:p>
+    <w:p>
+      <w:pPr>
+        <w:rPr>
+          <w:rFonts w:ascii="Times New Roman" w:hAnsi="Times New Roman" w:cs="Times New Roman"/>
+        </w:rPr>
+      </w:pPr>
+      <w:r>
+        <w:rPr>
+          <w:rFonts w:ascii="Times New Roman" w:hAnsi="Times New Roman" w:cs="Times New Roman"/>
+        </w:rPr>
+        <w:t>Motherboard:</w:t>
+      </w:r>
+      <w:r>
+        <w:rPr>
+          <w:rFonts w:ascii="Times New Roman" w:hAnsi="Times New Roman" w:cs="Times New Roman"/>
+        </w:rPr>
+        <w:t xml:space="preserve"> $</w:t>
+      </w:r>
+      <w:r>
+        <w:rPr>
+          <w:rFonts w:ascii="Times New Roman" w:hAnsi="Times New Roman" w:cs="Times New Roman"/>
+        </w:rPr>
+        <w:t>10</w:t>
+      </w:r>
+      <w:r>
+        <w:rPr>
+          <w:rFonts w:ascii="Times New Roman" w:hAnsi="Times New Roman" w:cs="Times New Roman"/>
+        </w:rPr>
+        <w:t>0</w:t>
+      </w:r>
+    </w:p>
+    <w:p>
+      <w:pPr>
+        <w:rPr>
+          <w:rFonts w:ascii="Times New Roman" w:hAnsi="Times New Roman" w:cs="Times New Roman"/>
+        </w:rPr>
+      </w:pPr>
+      <w:r>
+        <w:rPr>
+          <w:rFonts w:ascii="Times New Roman" w:hAnsi="Times New Roman" w:cs="Times New Roman"/>
+        </w:rPr>
+        <w:t>*</w:t>
+      </w:r>
+      <w:r>
+        <w:rPr>
+          <w:rFonts w:ascii="Times New Roman" w:hAnsi="Times New Roman" w:cs="Times New Roman"/>
+        </w:rPr>
+        <w:t>50</w:t>
+      </w:r>
+      <w:r>
+        <w:rPr>
+          <w:rFonts w:ascii="Times New Roman" w:hAnsi="Times New Roman" w:cs="Times New Roman"/>
+        </w:rPr>
+        <w:t xml:space="preserve">XX </w:t>
+      </w:r>
+      <w:r>
+        <w:rPr>
+          <w:rFonts w:ascii="Times New Roman" w:hAnsi="Times New Roman" w:cs="Times New Roman"/>
+        </w:rPr>
+        <w:t>Graphics Card:</w:t>
+      </w:r>
+      <w:r>
+        <w:rPr>
+          <w:rFonts w:ascii="Times New Roman" w:hAnsi="Times New Roman" w:cs="Times New Roman"/>
+        </w:rPr>
+        <w:t xml:space="preserve"> $300</w:t>
+      </w:r>
+    </w:p>
+    <w:p>
+      <w:pPr>
+        <w:rPr>
+          <w:rFonts w:ascii="Times New Roman" w:hAnsi="Times New Roman" w:cs="Times New Roman"/>
+        </w:rPr>
+      </w:pPr>
+      <w:r>
+        <w:rPr>
+          <w:rFonts w:ascii="Times New Roman" w:hAnsi="Times New Roman" w:cs="Times New Roman"/>
+        </w:rPr>
+        <w:t>Keyboard and Mouse Combo:</w:t>
+      </w:r>
+      <w:r>
+        <w:rPr>
+          <w:rFonts w:ascii="Times New Roman" w:hAnsi="Times New Roman" w:cs="Times New Roman"/>
+        </w:rPr>
+        <w:t xml:space="preserve"> </w:t>
+      </w:r>
+      <w:r>
+        <w:rPr>
+          <w:rFonts w:ascii="Times New Roman" w:hAnsi="Times New Roman" w:cs="Times New Roman"/>
+        </w:rPr>
+        <w:t>$30</w:t>
+      </w:r>
+    </w:p>
+    <w:p>
+      <w:pPr>
+        <w:rPr>
+          <w:rFonts w:ascii="Times New Roman" w:hAnsi="Times New Roman" w:cs="Times New Roman"/>
+        </w:rPr>
+      </w:pPr>
+      <w:r>
+        <w:rPr>
+          <w:rFonts w:ascii="Times New Roman" w:hAnsi="Times New Roman" w:cs="Times New Roman"/>
+        </w:rPr>
+        <w:t>**</w:t>
+      </w:r>
+      <w:r>
+        <w:rPr>
+          <w:rFonts w:ascii="Times New Roman" w:hAnsi="Times New Roman" w:cs="Times New Roman"/>
+        </w:rPr>
+        <w:t>Encl</w:t>
+      </w:r>
+      <w:r>
+        <w:rPr>
+          <w:rFonts w:ascii="Times New Roman" w:hAnsi="Times New Roman" w:cs="Times New Roman"/>
+        </w:rPr>
+        <w:t xml:space="preserve">ousre with </w:t>
+      </w:r>
+      <w:r>
+        <w:rPr>
+          <w:rFonts w:ascii="Times New Roman" w:hAnsi="Times New Roman" w:cs="Times New Roman"/>
+        </w:rPr>
+        <w:t>RFID reader</w:t>
+      </w:r>
+      <w:r>
+        <w:rPr>
+          <w:rFonts w:ascii="Times New Roman" w:hAnsi="Times New Roman" w:cs="Times New Roman"/>
+        </w:rPr>
+        <w:t>:</w:t>
+      </w:r>
+      <w:r>
+        <w:rPr>
+          <w:rFonts w:ascii="Times New Roman" w:hAnsi="Times New Roman" w:cs="Times New Roman"/>
+        </w:rPr>
+        <w:t xml:space="preserve"> $60</w:t>
+      </w:r>
+    </w:p>
+    <w:p>
+      <w:pPr>
+        <w:rPr>
+          <w:rFonts w:ascii="Times New Roman" w:hAnsi="Times New Roman" w:cs="Times New Roman"/>
+        </w:rPr>
+      </w:pPr>
+      <w:r>
+        <w:rPr>
+          <w:rFonts w:ascii="Times New Roman" w:hAnsi="Times New Roman" w:cs="Times New Roman"/>
+        </w:rPr>
+        <w:t>Thermal Paste:</w:t>
+      </w:r>
+      <w:r>
+        <w:rPr>
+          <w:rFonts w:ascii="Times New Roman" w:hAnsi="Times New Roman" w:cs="Times New Roman"/>
+        </w:rPr>
+        <w:t xml:space="preserve"> $10</w:t>
+      </w:r>
+    </w:p>
+    <w:p>
+      <w:pPr>
+        <w:rPr>
+          <w:rFonts w:ascii="Times New Roman" w:hAnsi="Times New Roman" w:cs="Times New Roman"/>
+        </w:rPr>
+      </w:pPr>
+      <w:r>
+        <w:rPr>
+          <w:rFonts w:ascii="Times New Roman" w:hAnsi="Times New Roman" w:cs="Times New Roman"/>
+        </w:rPr>
+        <w:t>**</w:t>
+      </w:r>
+      <w:r>
+        <w:rPr>
+          <w:rFonts w:ascii="Times New Roman" w:hAnsi="Times New Roman" w:cs="Times New Roman"/>
+        </w:rPr>
+        <w:t>5-inch LCD screen:</w:t>
+      </w:r>
+      <w:r>
+        <w:rPr>
+          <w:rFonts w:ascii="Times New Roman" w:hAnsi="Times New Roman" w:cs="Times New Roman"/>
+        </w:rPr>
+        <w:t xml:space="preserve"> $</w:t>
+      </w:r>
+      <w:r>
+        <w:rPr>
+          <w:rFonts w:ascii="Times New Roman" w:hAnsi="Times New Roman" w:cs="Times New Roman"/>
+        </w:rPr>
+        <w:t>80</w:t>
+      </w:r>
+    </w:p>
+    <w:p>
+      <w:pPr>
+        <w:rPr>
+          <w:rFonts w:ascii="Times New Roman" w:hAnsi="Times New Roman" w:cs="Times New Roman"/>
+        </w:rPr>
+      </w:pPr>
+      <w:r>
+        <w:rPr>
+          <w:rFonts w:ascii="Times New Roman" w:hAnsi="Times New Roman" w:cs="Times New Roman"/>
+        </w:rPr>
+        <w:lastRenderedPageBreak/>
+        <w:t>**</w:t>
+      </w:r>
+      <w:r>
+        <w:rPr>
+          <w:rFonts w:ascii="Times New Roman" w:hAnsi="Times New Roman" w:cs="Times New Roman"/>
+        </w:rPr>
+        <w:t>Raspberry Pi Chip:</w:t>
+      </w:r>
+      <w:r>
+        <w:rPr>
+          <w:rFonts w:ascii="Times New Roman" w:hAnsi="Times New Roman" w:cs="Times New Roman"/>
+        </w:rPr>
+        <w:t xml:space="preserve"> $50</w:t>
+      </w:r>
+    </w:p>
+    <w:p>
+      <w:pPr>
+        <w:rPr>
+          <w:rFonts w:ascii="Times New Roman" w:hAnsi="Times New Roman" w:cs="Times New Roman"/>
+        </w:rPr>
+      </w:pPr>
+      <w:r>
+        <w:rPr>
+          <w:rFonts w:ascii="Times New Roman" w:hAnsi="Times New Roman" w:cs="Times New Roman"/>
+        </w:rPr>
+        <w:t>**</w:t>
+      </w:r>
+      <w:r>
+        <w:rPr>
+          <w:rFonts w:ascii="Times New Roman" w:hAnsi="Times New Roman" w:cs="Times New Roman"/>
+        </w:rPr>
+        <w:t xml:space="preserve">Lithium </w:t>
+      </w:r>
+      <w:r>
+        <w:rPr>
+          <w:rFonts w:ascii="Times New Roman" w:hAnsi="Times New Roman" w:cs="Times New Roman"/>
+        </w:rPr>
+        <w:t>5V Power Supply:</w:t>
+      </w:r>
+      <w:r>
+        <w:rPr>
+          <w:rFonts w:ascii="Times New Roman" w:hAnsi="Times New Roman" w:cs="Times New Roman"/>
+        </w:rPr>
+        <w:t xml:space="preserve"> $40</w:t>
+      </w:r>
+    </w:p>
+    <w:p>
+      <w:pPr>
+        <w:rPr>
+          <w:rFonts w:ascii="Times New Roman" w:hAnsi="Times New Roman" w:cs="Times New Roman"/>
+        </w:rPr>
+      </w:pPr>
+    </w:p>
+    <w:p>
+      <w:pPr>
+        <w:rPr>
+          <w:rFonts w:ascii="Times New Roman" w:hAnsi="Times New Roman" w:cs="Times New Roman"/>
+        </w:rPr>
+      </w:pPr>
+      <w:r>
+        <w:rPr>
+          <w:rFonts w:ascii="Times New Roman" w:hAnsi="Times New Roman" w:cs="Times New Roman"/>
+        </w:rPr>
+        <w:t>Alright, let me add up the total of the parts Julian needs for his contraption</w:t>
+      </w:r>
+      <w:r>
+        <w:rPr>
+          <w:rFonts w:ascii="Times New Roman" w:hAnsi="Times New Roman" w:cs="Times New Roman"/>
+        </w:rPr>
+        <w:t xml:space="preserve"> and find some </w:t>
+      </w:r>
+      <w:r>
+        <w:rPr>
+          <w:rFonts w:ascii="Times New Roman" w:hAnsi="Times New Roman" w:cs="Times New Roman"/>
+        </w:rPr>
+        <w:t>generic descriptions of the things being sold</w:t>
+      </w:r>
+      <w:r>
+        <w:rPr>
+          <w:rFonts w:ascii="Times New Roman" w:hAnsi="Times New Roman" w:cs="Times New Roman"/>
+        </w:rPr>
+        <w:t xml:space="preserve">. </w:t>
+      </w:r>
+    </w:p>
+    <w:p>
+      <w:pPr>
+        <w:rPr>
+          <w:rFonts w:ascii="Times New Roman" w:hAnsi="Times New Roman" w:cs="Times New Roman"/>
+        </w:rPr>
+      </w:pPr>
+      <w:r>
+        <w:rPr>
+          <w:rFonts w:ascii="Times New Roman" w:hAnsi="Times New Roman" w:cs="Times New Roman"/>
+        </w:rPr>
+        <w:t>$230 isn’t bad</w:t>
+      </w:r>
+      <w:r>
+        <w:rPr>
+          <w:rFonts w:ascii="Times New Roman" w:hAnsi="Times New Roman" w:cs="Times New Roman"/>
+        </w:rPr>
+        <w:t xml:space="preserve">. It’s a little bit over the </w:t>
+      </w:r>
+      <w:r>
+        <w:rPr>
+          <w:rFonts w:ascii="Times New Roman" w:hAnsi="Times New Roman" w:cs="Times New Roman"/>
+        </w:rPr>
+        <w:t>initial $200.</w:t>
+      </w:r>
+      <w:r>
+        <w:rPr>
+          <w:rFonts w:ascii="Times New Roman" w:hAnsi="Times New Roman" w:cs="Times New Roman"/>
+        </w:rPr>
+        <w:t xml:space="preserve"> </w:t>
+      </w:r>
+      <w:r>
+        <w:rPr>
+          <w:rFonts w:ascii="Times New Roman" w:hAnsi="Times New Roman" w:cs="Times New Roman"/>
+        </w:rPr>
+        <w:t>Plus,</w:t>
+      </w:r>
+      <w:r>
+        <w:rPr>
+          <w:rFonts w:ascii="Times New Roman" w:hAnsi="Times New Roman" w:cs="Times New Roman"/>
+        </w:rPr>
+        <w:t xml:space="preserve"> the side quest graphics card being expensive is good, too</w:t>
+      </w:r>
+      <w:r>
+        <w:rPr>
+          <w:rFonts w:ascii="Times New Roman" w:hAnsi="Times New Roman" w:cs="Times New Roman"/>
+        </w:rPr>
+        <w:t xml:space="preserve">. </w:t>
+      </w:r>
+      <w:r>
+        <w:rPr>
+          <w:rFonts w:ascii="Times New Roman" w:hAnsi="Times New Roman" w:cs="Times New Roman"/>
+        </w:rPr>
+        <w:t xml:space="preserve">When it comes to </w:t>
+      </w:r>
+      <w:r>
+        <w:rPr>
+          <w:rFonts w:ascii="Times New Roman" w:hAnsi="Times New Roman" w:cs="Times New Roman"/>
+        </w:rPr>
+        <w:t>positioning them for sale in the game, I’ll spread out the items Julian wants.</w:t>
+      </w:r>
+    </w:p>
+    <w:p>
+      <w:pPr>
+        <w:rPr>
+          <w:rFonts w:ascii="Times New Roman" w:hAnsi="Times New Roman" w:cs="Times New Roman"/>
+        </w:rPr>
+      </w:pPr>
+      <w:r>
+        <w:rPr>
+          <w:rFonts w:ascii="Times New Roman" w:hAnsi="Times New Roman" w:cs="Times New Roman"/>
+        </w:rPr>
+        <w:t>Alright, the shop stuff is handled.</w:t>
+      </w:r>
+      <w:r>
+        <w:rPr>
+          <w:rFonts w:ascii="Times New Roman" w:hAnsi="Times New Roman" w:cs="Times New Roman"/>
+        </w:rPr>
+        <w:t xml:space="preserve"> Now, it’s pretty much the side quest </w:t>
+      </w:r>
+      <w:r>
+        <w:rPr>
+          <w:rFonts w:ascii="Times New Roman" w:hAnsi="Times New Roman" w:cs="Times New Roman"/>
+        </w:rPr>
+        <w:t xml:space="preserve">introduction and I have a few other opportunities here actually. </w:t>
+      </w:r>
+    </w:p>
+    <w:p>
+      <w:pPr>
+        <w:rPr>
+          <w:rFonts w:ascii="Times New Roman" w:hAnsi="Times New Roman" w:cs="Times New Roman"/>
+        </w:rPr>
+      </w:pPr>
+      <w:r>
+        <w:rPr>
+          <w:rFonts w:ascii="Times New Roman" w:hAnsi="Times New Roman" w:cs="Times New Roman"/>
+        </w:rPr>
+        <w:t>With Julian, specifically, I have the chance to flush him out more as a character and explore his interest with technology</w:t>
+      </w:r>
+      <w:r>
+        <w:rPr>
+          <w:rFonts w:ascii="Times New Roman" w:hAnsi="Times New Roman" w:cs="Times New Roman"/>
+        </w:rPr>
+        <w:t>. I feel like I’ve already done a basic overview on this, so how can I better explore Julian? I’ll give it some time since I literally have nothing right now</w:t>
+      </w:r>
+      <w:r>
+        <w:rPr>
+          <w:rFonts w:ascii="Times New Roman" w:hAnsi="Times New Roman" w:cs="Times New Roman"/>
+        </w:rPr>
+        <w:t xml:space="preserve">. </w:t>
+      </w:r>
+    </w:p>
+    <w:p>
+      <w:pPr>
+        <w:rPr>
+          <w:rFonts w:ascii="Times New Roman" w:hAnsi="Times New Roman" w:cs="Times New Roman"/>
+        </w:rPr>
+      </w:pPr>
+      <w:r>
+        <w:rPr>
+          <w:rFonts w:ascii="Times New Roman" w:hAnsi="Times New Roman" w:cs="Times New Roman"/>
+        </w:rPr>
+        <w:t>Anyways, establishing the side quest for the younger brother</w:t>
+      </w:r>
+      <w:r>
+        <w:rPr>
+          <w:rFonts w:ascii="Times New Roman" w:hAnsi="Times New Roman" w:cs="Times New Roman"/>
+        </w:rPr>
+        <w:t>. Does he have a name yet? Let me look through this real quick. If not, I’ll come up with something. Maybe I should make him a girl instead.</w:t>
+      </w:r>
+    </w:p>
+    <w:p>
+      <w:pPr>
+        <w:rPr>
+          <w:rFonts w:ascii="Times New Roman" w:hAnsi="Times New Roman" w:cs="Times New Roman"/>
+        </w:rPr>
+      </w:pPr>
+      <w:r>
+        <w:rPr>
+          <w:rFonts w:ascii="Times New Roman" w:hAnsi="Times New Roman" w:cs="Times New Roman"/>
+        </w:rPr>
+        <w:t>Oh damn, looks I have nothing actually recorded for it. I might need to look in other sheets for more information. This is kind of bad.</w:t>
+      </w:r>
+    </w:p>
+    <w:p>
+      <w:pPr>
+        <w:rPr>
+          <w:rFonts w:ascii="Times New Roman" w:hAnsi="Times New Roman" w:cs="Times New Roman"/>
+        </w:rPr>
+      </w:pPr>
+      <w:r>
+        <w:rPr>
+          <w:rFonts w:ascii="Times New Roman" w:hAnsi="Times New Roman" w:cs="Times New Roman"/>
+        </w:rPr>
+        <w:t xml:space="preserve">Holy shit, I completely forgot the initial plan. </w:t>
+      </w:r>
+      <w:r>
+        <w:rPr>
+          <w:rFonts w:ascii="Times New Roman" w:hAnsi="Times New Roman" w:cs="Times New Roman"/>
+        </w:rPr>
+        <w:t>So,</w:t>
+      </w:r>
+      <w:r>
+        <w:rPr>
+          <w:rFonts w:ascii="Times New Roman" w:hAnsi="Times New Roman" w:cs="Times New Roman"/>
+        </w:rPr>
+        <w:t xml:space="preserve"> I actually don’t need to have them in the shop.</w:t>
+      </w:r>
+    </w:p>
+    <w:p>
+      <w:pPr>
+        <w:rPr>
+          <w:rFonts w:ascii="Times New Roman" w:hAnsi="Times New Roman" w:cs="Times New Roman"/>
+        </w:rPr>
+      </w:pPr>
+      <w:r>
+        <w:rPr>
+          <w:rFonts w:ascii="Times New Roman" w:hAnsi="Times New Roman" w:cs="Times New Roman"/>
+        </w:rPr>
+        <w:t xml:space="preserve">I need to change the Birkdale main menu </w:t>
+      </w:r>
+      <w:r>
+        <w:rPr>
+          <w:rFonts w:ascii="Times New Roman" w:hAnsi="Times New Roman" w:cs="Times New Roman"/>
+        </w:rPr>
+        <w:t>options,</w:t>
+      </w:r>
+      <w:r>
+        <w:rPr>
+          <w:rFonts w:ascii="Times New Roman" w:hAnsi="Times New Roman" w:cs="Times New Roman"/>
+        </w:rPr>
+        <w:t xml:space="preserve"> I guess. Maybe the player can see them in the park with the box. I think I still have the park as an option</w:t>
+      </w:r>
+      <w:r>
+        <w:rPr>
+          <w:rFonts w:ascii="Times New Roman" w:hAnsi="Times New Roman" w:cs="Times New Roman"/>
+        </w:rPr>
+        <w:t>.</w:t>
+      </w:r>
+    </w:p>
+    <w:p>
+      <w:pPr>
+        <w:rPr>
+          <w:rFonts w:ascii="Times New Roman" w:hAnsi="Times New Roman" w:cs="Times New Roman"/>
+        </w:rPr>
+      </w:pPr>
+      <w:r>
+        <w:rPr>
+          <w:rFonts w:ascii="Times New Roman" w:hAnsi="Times New Roman" w:cs="Times New Roman"/>
+        </w:rPr>
+        <w:t>Then change of plans. Walking around the store, what are we looking for? The Julian stuff is still important, but maybe this can act as an opportunity to explore the player character’s past</w:t>
+      </w:r>
+      <w:r>
+        <w:rPr>
+          <w:rFonts w:ascii="Times New Roman" w:hAnsi="Times New Roman" w:cs="Times New Roman"/>
+        </w:rPr>
+        <w:t xml:space="preserve"> and each partner can have a specific line in response to that.</w:t>
+      </w:r>
+      <w:r>
+        <w:rPr>
+          <w:rFonts w:ascii="Times New Roman" w:hAnsi="Times New Roman" w:cs="Times New Roman"/>
+        </w:rPr>
+        <w:t xml:space="preserve"> But I’ll work on that later. I need some ideas.</w:t>
+      </w:r>
+    </w:p>
+    <w:p>
+      <w:pPr>
+        <w:rPr>
+          <w:rFonts w:ascii="Times New Roman" w:hAnsi="Times New Roman" w:cs="Times New Roman"/>
+        </w:rPr>
+      </w:pPr>
+      <w:r>
+        <w:rPr>
+          <w:rFonts w:ascii="Times New Roman" w:hAnsi="Times New Roman" w:cs="Times New Roman"/>
+        </w:rPr>
+        <w:t>Maybe the kid brother/sister can be in the computer parts shop on Day II or something. Giving the player a different place to meet</w:t>
+      </w:r>
+      <w:r>
+        <w:rPr>
+          <w:rFonts w:ascii="Times New Roman" w:hAnsi="Times New Roman" w:cs="Times New Roman"/>
+        </w:rPr>
+        <w:t xml:space="preserve"> them.</w:t>
+      </w:r>
+    </w:p>
+    <w:p>
+      <w:pPr>
+        <w:rPr>
+          <w:rFonts w:ascii="Times New Roman" w:hAnsi="Times New Roman" w:cs="Times New Roman"/>
+        </w:rPr>
+      </w:pPr>
+      <w:r>
+        <w:rPr>
+          <w:rFonts w:ascii="Times New Roman" w:hAnsi="Times New Roman" w:cs="Times New Roman"/>
+        </w:rPr>
+        <w:t>---------------------------------------------------------------------------------------------------------------------</w:t>
+      </w:r>
+    </w:p>
+    <w:p>
+      <w:pPr>
+        <w:rPr>
+          <w:rFonts w:ascii="Times New Roman" w:hAnsi="Times New Roman" w:cs="Times New Roman"/>
+        </w:rPr>
+      </w:pPr>
+      <w:r>
+        <w:rPr>
+          <w:rFonts w:ascii="Times New Roman" w:hAnsi="Times New Roman" w:cs="Times New Roman"/>
+        </w:rPr>
+        <w:t>Chat GPT is coming in pretty clutch. This a lot of useful information</w:t>
+      </w:r>
+      <w:r>
+        <w:rPr>
+          <w:rFonts w:ascii="Times New Roman" w:hAnsi="Times New Roman" w:cs="Times New Roman"/>
+        </w:rPr>
+        <w:t xml:space="preserve">. But focusing on the </w:t>
+      </w:r>
+      <w:r>
+        <w:rPr>
+          <w:rFonts w:ascii="Times New Roman" w:hAnsi="Times New Roman" w:cs="Times New Roman"/>
+        </w:rPr>
+        <w:t>exercising platoon scene. I do think that there should</w:t>
+      </w:r>
+      <w:r>
+        <w:rPr>
+          <w:rFonts w:ascii="Times New Roman" w:hAnsi="Times New Roman" w:cs="Times New Roman"/>
+        </w:rPr>
+        <w:t xml:space="preserve"> civilians that have been or are being radicalized to work with the government in defending the </w:t>
+      </w:r>
+      <w:r>
+        <w:rPr>
+          <w:rFonts w:ascii="Times New Roman" w:hAnsi="Times New Roman" w:cs="Times New Roman"/>
+        </w:rPr>
+        <w:t xml:space="preserve">Birkdale. The reality of it is that there was an attack against the soldiers and they lost some </w:t>
+      </w:r>
+      <w:r>
+        <w:rPr>
+          <w:rFonts w:ascii="Times New Roman" w:hAnsi="Times New Roman" w:cs="Times New Roman"/>
+        </w:rPr>
+        <w:t>people and some townspeople were hurt thus motivating some to want to take up arms to fight against those in Hunter’s Poin</w:t>
+      </w:r>
+      <w:r>
+        <w:rPr>
+          <w:rFonts w:ascii="Times New Roman" w:hAnsi="Times New Roman" w:cs="Times New Roman"/>
+        </w:rPr>
+        <w:t xml:space="preserve">te. </w:t>
+      </w:r>
+      <w:r>
+        <w:rPr>
+          <w:rFonts w:ascii="Times New Roman" w:hAnsi="Times New Roman" w:cs="Times New Roman"/>
+        </w:rPr>
+        <w:t xml:space="preserve">The idea </w:t>
+      </w:r>
+      <w:r>
+        <w:rPr>
+          <w:rFonts w:ascii="Times New Roman" w:hAnsi="Times New Roman" w:cs="Times New Roman"/>
+        </w:rPr>
+        <w:lastRenderedPageBreak/>
+        <w:t xml:space="preserve">of civilians training with </w:t>
+      </w:r>
+      <w:r>
+        <w:rPr>
+          <w:rFonts w:ascii="Times New Roman" w:hAnsi="Times New Roman" w:cs="Times New Roman"/>
+        </w:rPr>
+        <w:t>the soldier</w:t>
+      </w:r>
+      <w:r>
+        <w:rPr>
+          <w:rFonts w:ascii="Times New Roman" w:hAnsi="Times New Roman" w:cs="Times New Roman"/>
+        </w:rPr>
+        <w:t>s is supposed to give the impression/idea that the people still do have agency and control over what happens to their town with their involvement.</w:t>
+      </w:r>
+      <w:r>
+        <w:rPr>
+          <w:rFonts w:ascii="Times New Roman" w:hAnsi="Times New Roman" w:cs="Times New Roman"/>
+        </w:rPr>
+        <w:t xml:space="preserve"> I should use some characters that were created for the arm-wrestling mini game for this. That way I don’t have to come up with new characters. This should also be an instance to better promote Camille’s </w:t>
+      </w:r>
+      <w:r>
+        <w:rPr>
+          <w:rFonts w:ascii="Times New Roman" w:hAnsi="Times New Roman" w:cs="Times New Roman"/>
+        </w:rPr>
+        <w:t>significance to the townspeople in this scene. Maybe she can dismantle and reassemble a rifle extremely quick</w:t>
+      </w:r>
+      <w:r>
+        <w:rPr>
+          <w:rFonts w:ascii="Times New Roman" w:hAnsi="Times New Roman" w:cs="Times New Roman"/>
+        </w:rPr>
+        <w:t>. Increasing her fame/popularity with even the soldiers suggesting that she join their ranks</w:t>
+      </w:r>
+      <w:r>
+        <w:rPr>
+          <w:rFonts w:ascii="Times New Roman" w:hAnsi="Times New Roman" w:cs="Times New Roman"/>
+        </w:rPr>
+        <w:t>. She’ll refuse since she’s taken an oath with Gaia’s Advocates to protect those in ne</w:t>
+      </w:r>
+      <w:r>
+        <w:rPr>
+          <w:rFonts w:ascii="Times New Roman" w:hAnsi="Times New Roman" w:cs="Times New Roman"/>
+        </w:rPr>
+        <w:t xml:space="preserve">ed as well as the planet. This doesn’t completely seem to follow her current character, but that’s fine since she’s changing </w:t>
+      </w:r>
+      <w:r>
+        <w:rPr>
+          <w:rFonts w:ascii="Times New Roman" w:hAnsi="Times New Roman" w:cs="Times New Roman"/>
+        </w:rPr>
+        <w:t>in this level as a person.</w:t>
+      </w:r>
+    </w:p>
+    <w:p>
+      <w:pPr>
+        <w:rPr>
+          <w:rFonts w:ascii="Times New Roman" w:hAnsi="Times New Roman" w:cs="Times New Roman"/>
+        </w:rPr>
+      </w:pPr>
+      <w:r>
+        <w:rPr>
+          <w:rFonts w:ascii="Times New Roman" w:hAnsi="Times New Roman" w:cs="Times New Roman"/>
+        </w:rPr>
+        <w:t>Okay, so the running platoon comes back to a</w:t>
+      </w:r>
+      <w:r>
+        <w:rPr>
+          <w:rFonts w:ascii="Times New Roman" w:hAnsi="Times New Roman" w:cs="Times New Roman"/>
+        </w:rPr>
+        <w:t>n area designated for the soldiers. The player can talk to some soldiers and civilians that just finished the run</w:t>
+      </w:r>
+      <w:r>
+        <w:rPr>
+          <w:rFonts w:ascii="Times New Roman" w:hAnsi="Times New Roman" w:cs="Times New Roman"/>
+        </w:rPr>
+        <w:t xml:space="preserve">, a sergeant leading weapons maintenance and </w:t>
+      </w:r>
+      <w:r>
+        <w:rPr>
+          <w:rFonts w:ascii="Times New Roman" w:hAnsi="Times New Roman" w:cs="Times New Roman"/>
+        </w:rPr>
+        <w:t>training (this is where Camille could disassemble and reassemble the rifle)</w:t>
+      </w:r>
+      <w:r>
+        <w:rPr>
+          <w:rFonts w:ascii="Times New Roman" w:hAnsi="Times New Roman" w:cs="Times New Roman"/>
+        </w:rPr>
+        <w:t xml:space="preserve">, and possibly speak to a </w:t>
+      </w:r>
+      <w:r>
+        <w:rPr>
+          <w:rFonts w:ascii="Times New Roman" w:hAnsi="Times New Roman" w:cs="Times New Roman"/>
+        </w:rPr>
+        <w:t>lieutenant</w:t>
+      </w:r>
+      <w:r>
+        <w:rPr>
+          <w:rFonts w:ascii="Times New Roman" w:hAnsi="Times New Roman" w:cs="Times New Roman"/>
+        </w:rPr>
+        <w:t xml:space="preserve"> some kind of officer in charge</w:t>
+      </w:r>
+      <w:r>
+        <w:rPr>
+          <w:rFonts w:ascii="Times New Roman" w:hAnsi="Times New Roman" w:cs="Times New Roman"/>
+        </w:rPr>
+        <w:t xml:space="preserve">. I think the </w:t>
+      </w:r>
+      <w:r>
+        <w:rPr>
+          <w:rFonts w:ascii="Times New Roman" w:hAnsi="Times New Roman" w:cs="Times New Roman"/>
+        </w:rPr>
+        <w:t>sergeant</w:t>
+      </w:r>
+      <w:r>
+        <w:rPr>
+          <w:rFonts w:ascii="Times New Roman" w:hAnsi="Times New Roman" w:cs="Times New Roman"/>
+        </w:rPr>
+        <w:t xml:space="preserve"> should be more stern and almost hard as Chat GPT suggested with that scene and the lieutenant should </w:t>
+      </w:r>
+      <w:r>
+        <w:rPr>
+          <w:rFonts w:ascii="Times New Roman" w:hAnsi="Times New Roman" w:cs="Times New Roman"/>
+        </w:rPr>
+        <w:t xml:space="preserve">be a bit more light heartened with the intent of keeping the peace and recruiting others through compassion. Speaking of compassion, the Altered. This could be an instance where the Altered and how they are accepted can come into play. </w:t>
+      </w:r>
+    </w:p>
+    <w:p>
+      <w:pPr>
+        <w:rPr>
+          <w:rFonts w:ascii="Times New Roman" w:hAnsi="Times New Roman" w:cs="Times New Roman"/>
+        </w:rPr>
+      </w:pPr>
+      <w:r>
+        <w:rPr>
+          <w:rFonts w:ascii="Times New Roman" w:hAnsi="Times New Roman" w:cs="Times New Roman"/>
+        </w:rPr>
+        <w:t xml:space="preserve">I mean, Chat GPT kind of got it for a potential intro. I might have to copy it, honestly. It’s a good idea. Just edit the </w:t>
+      </w:r>
+      <w:r>
+        <w:rPr>
+          <w:rFonts w:ascii="Times New Roman" w:hAnsi="Times New Roman" w:cs="Times New Roman"/>
+        </w:rPr>
+        <w:t xml:space="preserve">chant. Also </w:t>
+      </w:r>
+      <w:r>
+        <w:rPr>
+          <w:rFonts w:ascii="Times New Roman" w:hAnsi="Times New Roman" w:cs="Times New Roman"/>
+        </w:rPr>
+        <w:t>the suggestion of rotating the interaction across days changing the atmosphere is great, too. The only thing is that the townspeople don’t know a battle is actually on the horizon. They just want to be able to protect those they care for and the government is willing to train and supply them with the means to do it.</w:t>
+      </w:r>
+    </w:p>
+    <w:p>
+      <w:pPr>
+        <w:rPr>
+          <w:rFonts w:ascii="Times New Roman" w:hAnsi="Times New Roman" w:cs="Times New Roman"/>
+        </w:rPr>
+      </w:pPr>
+      <w:r>
+        <w:rPr>
+          <w:rFonts w:ascii="Times New Roman" w:hAnsi="Times New Roman" w:cs="Times New Roman"/>
+        </w:rPr>
+        <w:t>The small revealing incident is good, too. It’s important to stress that this isn’t all shits and giggles. There’s a reason why the military is here. I’ll copy that scene as well</w:t>
+      </w:r>
+      <w:r>
+        <w:rPr>
+          <w:rFonts w:ascii="Times New Roman" w:hAnsi="Times New Roman" w:cs="Times New Roman"/>
+        </w:rPr>
+        <w:t>.</w:t>
+      </w:r>
+    </w:p>
+    <w:p>
+      <w:pPr>
+        <w:rPr>
+          <w:rFonts w:ascii="Times New Roman" w:hAnsi="Times New Roman" w:cs="Times New Roman"/>
+        </w:rPr>
+      </w:pPr>
+      <w:r>
+        <w:rPr>
+          <w:rFonts w:ascii="Times New Roman" w:hAnsi="Times New Roman" w:cs="Times New Roman"/>
+        </w:rPr>
+        <w:t>“Community defense initiatives” I like that.</w:t>
+      </w:r>
+    </w:p>
+    <w:p>
+      <w:pPr>
+        <w:rPr>
+          <w:rFonts w:ascii="Times New Roman" w:hAnsi="Times New Roman" w:cs="Times New Roman"/>
+        </w:rPr>
+      </w:pPr>
+      <w:r>
+        <w:rPr>
+          <w:rFonts w:ascii="Times New Roman" w:hAnsi="Times New Roman" w:cs="Times New Roman"/>
+        </w:rPr>
+        <w:t>Alright, looks like I have a decent amount to work with here</w:t>
+      </w:r>
+      <w:r>
+        <w:rPr>
+          <w:rFonts w:ascii="Times New Roman" w:hAnsi="Times New Roman" w:cs="Times New Roman"/>
+        </w:rPr>
+        <w:t>. This is great.</w:t>
+      </w:r>
+    </w:p>
+    <w:p>
+      <w:pPr>
+        <w:rPr>
+          <w:rFonts w:ascii="Times New Roman" w:hAnsi="Times New Roman" w:cs="Times New Roman"/>
+        </w:rPr>
+      </w:pPr>
+      <w:r>
+        <w:rPr>
+          <w:rFonts w:ascii="Times New Roman" w:hAnsi="Times New Roman" w:cs="Times New Roman"/>
+        </w:rPr>
+        <w:t>Sergeant vs lieutenant ideologies will be reflective of how the military actually works too. The enlisted are the real boots on the ground people while the officers are the planners, not necessarily there to see how things work</w:t>
+      </w:r>
+    </w:p>
+    <w:p>
+      <w:pPr>
+        <w:rPr>
+          <w:rFonts w:ascii="Times New Roman" w:hAnsi="Times New Roman" w:cs="Times New Roman"/>
+        </w:rPr>
+      </w:pPr>
+      <w:r>
+        <w:rPr>
+          <w:rFonts w:ascii="Times New Roman" w:hAnsi="Times New Roman" w:cs="Times New Roman"/>
+        </w:rPr>
+        <w:t xml:space="preserve">Alright, I have a lot to work with here. Almost too much. </w:t>
+      </w:r>
+      <w:r>
+        <w:rPr>
+          <w:rFonts w:ascii="Times New Roman" w:hAnsi="Times New Roman" w:cs="Times New Roman"/>
+        </w:rPr>
+        <w:t>Let me just start the intro and decide on some options for the player to pick from to get things going.</w:t>
+      </w:r>
+    </w:p>
+    <w:p>
+      <w:pPr>
+        <w:rPr>
+          <w:rFonts w:ascii="Times New Roman" w:hAnsi="Times New Roman" w:cs="Times New Roman"/>
+        </w:rPr>
+      </w:pPr>
+      <w:r>
+        <w:rPr>
+          <w:rFonts w:ascii="Times New Roman" w:hAnsi="Times New Roman" w:cs="Times New Roman"/>
+        </w:rPr>
+        <w:t xml:space="preserve">Alright, so much good stuff here. It’s almost overwhelming. I can feel my head working differently lol. I’m going to copy the </w:t>
+      </w:r>
+      <w:r>
+        <w:rPr>
+          <w:rFonts w:ascii="Times New Roman" w:hAnsi="Times New Roman" w:cs="Times New Roman"/>
+        </w:rPr>
+        <w:t>chat GPT suggestions for now in another document and use it as reference next time to better establish the scene. At this rate I should be able to finished the exercising platoon section</w:t>
+      </w:r>
+      <w:r>
+        <w:rPr>
+          <w:rFonts w:ascii="Times New Roman" w:hAnsi="Times New Roman" w:cs="Times New Roman"/>
+        </w:rPr>
+        <w:t xml:space="preserve"> pretty quickly tomorrow.</w:t>
+      </w:r>
     </w:p>
     <w:sectPr>
       <w:pgSz w:w="12240" w:h="15840"/>

</xml_diff>